<commit_message>
victimization analysis - added police variables
</commit_message>
<xml_diff>
--- a/Prelim Folder/Survey and Flow.docx
+++ b/Prelim Folder/Survey and Flow.docx
@@ -39284,7 +39284,15 @@
         <w:keepNext/>
       </w:pPr>
       <w:r>
-        <w:t>Q30 Over the years, how much attention do you feel the government pays to what the people think when it decides what to do?</w:t>
+        <w:t>Q30</w:t>
+      </w:r>
+    </w:p>
+    <w:p>
+      <w:pPr>
+        <w:keepNext/>
+      </w:pPr>
+      <w:r>
+        <w:t xml:space="preserve"> Over the years, how much attention do you feel the government pays to what the people think when it decides what to do?</w:t>
       </w:r>
     </w:p>
     <w:p>
@@ -39465,7 +39473,6 @@
       </w:pPr>
       <w:proofErr w:type="gramStart"/>
       <w:r>
-        <w:lastRenderedPageBreak/>
         <w:t>Q110</w:t>
       </w:r>
       <w:proofErr w:type="gramEnd"/>

</xml_diff>